<commit_message>
Fill cover: submission deadline and word count
</commit_message>
<xml_diff>
--- a/OS_CW1_00022128.docx
+++ b/OS_CW1_00022128.docx
@@ -465,6 +465,9 @@
                 <w:lang w:val="en-GB"/>
               </w:rPr>
             </w:pPr>
+            <w:r>
+              <w:t>6/5/2026 11:59:59 PM</w:t>
+            </w:r>
           </w:p>
         </w:tc>
       </w:tr>
@@ -515,6 +518,9 @@
                 <w:lang w:val="en-GB"/>
               </w:rPr>
             </w:pPr>
+            <w:r>
+              <w:t>4987</w:t>
+            </w:r>
           </w:p>
         </w:tc>
       </w:tr>

</xml_diff>